<commit_message>
add section 3 plots and code
</commit_message>
<xml_diff>
--- a/part-1/part_1_report.docx
+++ b/part-1/part_1_report.docx
@@ -243,25 +243,7 @@
           <w:sz w:val="36"/>
           <w:szCs w:val="36"/>
         </w:rPr>
-        <w:t xml:space="preserve">Mazen </w:t>
-      </w:r>
-      <w:proofErr w:type="spellStart"/>
-      <w:r>
-        <w:rPr>
-          <w:rFonts w:asciiTheme="majorBidi" w:hAnsiTheme="majorBidi" w:cstheme="majorBidi"/>
-          <w:sz w:val="36"/>
-          <w:szCs w:val="36"/>
-        </w:rPr>
-        <w:t>Elkaslan</w:t>
-      </w:r>
-      <w:proofErr w:type="spellEnd"/>
-      <w:r>
-        <w:rPr>
-          <w:rFonts w:asciiTheme="majorBidi" w:hAnsiTheme="majorBidi" w:cstheme="majorBidi"/>
-          <w:sz w:val="36"/>
-          <w:szCs w:val="36"/>
-        </w:rPr>
-        <w:t xml:space="preserve"> (G2 S1) </w:t>
+        <w:t xml:space="preserve">Mazen Elkaslan (G2 S1) </w:t>
       </w:r>
       <w:r>
         <w:rPr>
@@ -5546,6 +5528,1096 @@
           <w:szCs w:val="32"/>
         </w:rPr>
         <w:t>Implementation and Validation</w:t>
+      </w:r>
+    </w:p>
+    <w:p>
+      <w:pPr>
+        <w:rPr>
+          <w:rFonts w:asciiTheme="majorBidi" w:hAnsiTheme="majorBidi" w:cstheme="majorBidi"/>
+          <w:sz w:val="28"/>
+          <w:szCs w:val="28"/>
+        </w:rPr>
+      </w:pPr>
+      <w:r>
+        <w:rPr>
+          <w:rFonts w:asciiTheme="majorBidi" w:hAnsiTheme="majorBidi" w:cstheme="majorBidi"/>
+          <w:sz w:val="28"/>
+          <w:szCs w:val="28"/>
+        </w:rPr>
+        <w:t>Now</w:t>
+      </w:r>
+      <w:r>
+        <w:rPr>
+          <w:rFonts w:asciiTheme="majorBidi" w:hAnsiTheme="majorBidi" w:cstheme="majorBidi"/>
+          <w:sz w:val="28"/>
+          <w:szCs w:val="28"/>
+        </w:rPr>
+        <w:t xml:space="preserve"> that all the required filters have been designed and implemented individually, they will be combined to accomplish the stated objectives above.</w:t>
+      </w:r>
+    </w:p>
+    <w:p>
+      <w:pPr>
+        <w:rPr>
+          <w:rFonts w:asciiTheme="majorBidi" w:hAnsiTheme="majorBidi" w:cstheme="majorBidi"/>
+          <w:sz w:val="28"/>
+          <w:szCs w:val="28"/>
+        </w:rPr>
+      </w:pPr>
+      <w:r>
+        <w:rPr>
+          <w:rFonts w:asciiTheme="majorBidi" w:hAnsiTheme="majorBidi" w:cstheme="majorBidi"/>
+          <w:sz w:val="28"/>
+          <w:szCs w:val="28"/>
+        </w:rPr>
+        <w:t xml:space="preserve">Here is the MATLAB code used to define all the filters in one program, pass the signals of both </w:t>
+      </w:r>
+      <w:r>
+        <w:rPr>
+          <w:rFonts w:asciiTheme="majorBidi" w:hAnsiTheme="majorBidi" w:cstheme="majorBidi"/>
+          <w:i/>
+          <w:iCs/>
+          <w:sz w:val="28"/>
+          <w:szCs w:val="28"/>
+        </w:rPr>
+        <w:t>Record 100</w:t>
+      </w:r>
+      <w:r>
+        <w:rPr>
+          <w:rFonts w:asciiTheme="majorBidi" w:hAnsiTheme="majorBidi" w:cstheme="majorBidi"/>
+          <w:sz w:val="28"/>
+          <w:szCs w:val="28"/>
+        </w:rPr>
+        <w:t xml:space="preserve"> and </w:t>
+      </w:r>
+      <w:r>
+        <w:rPr>
+          <w:rFonts w:asciiTheme="majorBidi" w:hAnsiTheme="majorBidi" w:cstheme="majorBidi"/>
+          <w:i/>
+          <w:iCs/>
+          <w:sz w:val="28"/>
+          <w:szCs w:val="28"/>
+        </w:rPr>
+        <w:t>Record 106</w:t>
+      </w:r>
+      <w:r>
+        <w:rPr>
+          <w:rFonts w:asciiTheme="majorBidi" w:hAnsiTheme="majorBidi" w:cstheme="majorBidi"/>
+          <w:i/>
+          <w:iCs/>
+          <w:sz w:val="28"/>
+          <w:szCs w:val="28"/>
+        </w:rPr>
+        <w:t xml:space="preserve"> </w:t>
+      </w:r>
+      <w:r>
+        <w:rPr>
+          <w:rFonts w:asciiTheme="majorBidi" w:hAnsiTheme="majorBidi" w:cstheme="majorBidi"/>
+          <w:sz w:val="28"/>
+          <w:szCs w:val="28"/>
+        </w:rPr>
+        <w:t>through th</w:t>
+      </w:r>
+      <w:r>
+        <w:rPr>
+          <w:rFonts w:asciiTheme="majorBidi" w:hAnsiTheme="majorBidi" w:cstheme="majorBidi"/>
+          <w:sz w:val="28"/>
+          <w:szCs w:val="28"/>
+        </w:rPr>
+        <w:t>e cascaded filters, and display a few comparison plots to prove the filters effects and the output signals:</w:t>
+      </w:r>
+    </w:p>
+    <w:p>
+      <w:pPr>
+        <w:rPr>
+          <w:rFonts w:asciiTheme="majorBidi" w:hAnsiTheme="majorBidi" w:cstheme="majorBidi"/>
+          <w:sz w:val="28"/>
+          <w:szCs w:val="28"/>
+        </w:rPr>
+      </w:pPr>
+      <w:r>
+        <w:rPr>
+          <w:rFonts w:asciiTheme="majorBidi" w:hAnsiTheme="majorBidi" w:cstheme="majorBidi"/>
+          <w:sz w:val="28"/>
+          <w:szCs w:val="28"/>
+          <w:u w:val="single"/>
+        </w:rPr>
+        <w:t>NOTE</w:t>
+      </w:r>
+      <w:r>
+        <w:rPr>
+          <w:rFonts w:asciiTheme="majorBidi" w:hAnsiTheme="majorBidi" w:cstheme="majorBidi"/>
+          <w:sz w:val="28"/>
+          <w:szCs w:val="28"/>
+        </w:rPr>
+        <w:t xml:space="preserve">: Consider </w:t>
+      </w:r>
+      <w:r>
+        <w:rPr>
+          <w:rFonts w:asciiTheme="majorBidi" w:hAnsiTheme="majorBidi" w:cstheme="majorBidi"/>
+          <w:b/>
+          <w:bCs/>
+          <w:sz w:val="28"/>
+          <w:szCs w:val="28"/>
+        </w:rPr>
+        <w:t>ecg100</w:t>
+      </w:r>
+      <w:r>
+        <w:rPr>
+          <w:rFonts w:asciiTheme="majorBidi" w:hAnsiTheme="majorBidi" w:cstheme="majorBidi"/>
+          <w:sz w:val="28"/>
+          <w:szCs w:val="28"/>
+        </w:rPr>
+        <w:t xml:space="preserve"> and </w:t>
+      </w:r>
+      <w:r>
+        <w:rPr>
+          <w:rFonts w:asciiTheme="majorBidi" w:hAnsiTheme="majorBidi" w:cstheme="majorBidi"/>
+          <w:b/>
+          <w:bCs/>
+          <w:sz w:val="28"/>
+          <w:szCs w:val="28"/>
+        </w:rPr>
+        <w:t>ecg106</w:t>
+      </w:r>
+      <w:r>
+        <w:rPr>
+          <w:rFonts w:asciiTheme="majorBidi" w:hAnsiTheme="majorBidi" w:cstheme="majorBidi"/>
+          <w:sz w:val="28"/>
+          <w:szCs w:val="28"/>
+        </w:rPr>
+        <w:t xml:space="preserve"> as signal data matrixes for Record 100 and Record 106 respectively, and </w:t>
+      </w:r>
+      <w:r>
+        <w:rPr>
+          <w:rFonts w:asciiTheme="majorBidi" w:hAnsiTheme="majorBidi" w:cstheme="majorBidi"/>
+          <w:b/>
+          <w:bCs/>
+          <w:sz w:val="28"/>
+          <w:szCs w:val="28"/>
+        </w:rPr>
+        <w:t>t</w:t>
+      </w:r>
+      <w:r>
+        <w:rPr>
+          <w:rFonts w:asciiTheme="majorBidi" w:hAnsiTheme="majorBidi" w:cstheme="majorBidi"/>
+          <w:sz w:val="28"/>
+          <w:szCs w:val="28"/>
+        </w:rPr>
+        <w:t xml:space="preserve"> as follows in the variable assignment.</w:t>
+      </w:r>
+    </w:p>
+    <w:p>
+      <w:pPr>
+        <w:rPr>
+          <w:rFonts w:asciiTheme="majorBidi" w:hAnsiTheme="majorBidi" w:cstheme="majorBidi"/>
+          <w:sz w:val="28"/>
+          <w:szCs w:val="28"/>
+        </w:rPr>
+      </w:pPr>
+    </w:p>
+    <w:p>
+      <w:pPr>
+        <w:rPr>
+          <w:rFonts w:asciiTheme="majorBidi" w:hAnsiTheme="majorBidi" w:cstheme="majorBidi"/>
+          <w:sz w:val="28"/>
+          <w:szCs w:val="28"/>
+        </w:rPr>
+      </w:pPr>
+      <w:r>
+        <w:rPr>
+          <w:rFonts w:asciiTheme="majorBidi" w:hAnsiTheme="majorBidi" w:cstheme="majorBidi"/>
+          <w:noProof/>
+          <w:sz w:val="28"/>
+          <w:szCs w:val="28"/>
+        </w:rPr>
+        <w:lastRenderedPageBreak/>
+        <w:drawing>
+          <wp:inline distT="0" distB="0" distL="0" distR="0" wp14:anchorId="1FFE576F" wp14:editId="7B6D119E">
+            <wp:extent cx="3345180" cy="216817"/>
+            <wp:effectExtent l="0" t="0" r="0" b="0"/>
+            <wp:docPr id="1705367011" name="Picture 1"/>
+            <wp:cNvGraphicFramePr>
+              <a:graphicFrameLocks xmlns:a="http://schemas.openxmlformats.org/drawingml/2006/main" noChangeAspect="1"/>
+            </wp:cNvGraphicFramePr>
+            <a:graphic xmlns:a="http://schemas.openxmlformats.org/drawingml/2006/main">
+              <a:graphicData uri="http://schemas.openxmlformats.org/drawingml/2006/picture">
+                <pic:pic xmlns:pic="http://schemas.openxmlformats.org/drawingml/2006/picture">
+                  <pic:nvPicPr>
+                    <pic:cNvPr id="1705367011" name=""/>
+                    <pic:cNvPicPr/>
+                  </pic:nvPicPr>
+                  <pic:blipFill>
+                    <a:blip r:embed="rId24"/>
+                    <a:stretch>
+                      <a:fillRect/>
+                    </a:stretch>
+                  </pic:blipFill>
+                  <pic:spPr>
+                    <a:xfrm>
+                      <a:off x="0" y="0"/>
+                      <a:ext cx="3439757" cy="222947"/>
+                    </a:xfrm>
+                    <a:prstGeom prst="rect">
+                      <a:avLst/>
+                    </a:prstGeom>
+                  </pic:spPr>
+                </pic:pic>
+              </a:graphicData>
+            </a:graphic>
+          </wp:inline>
+        </w:drawing>
+      </w:r>
+    </w:p>
+    <w:p>
+      <w:pPr>
+        <w:rPr>
+          <w:rFonts w:asciiTheme="majorBidi" w:hAnsiTheme="majorBidi" w:cstheme="majorBidi"/>
+          <w:sz w:val="28"/>
+          <w:szCs w:val="28"/>
+        </w:rPr>
+      </w:pPr>
+      <w:r>
+        <w:rPr>
+          <w:rFonts w:asciiTheme="majorBidi" w:hAnsiTheme="majorBidi" w:cstheme="majorBidi"/>
+          <w:noProof/>
+          <w:sz w:val="28"/>
+          <w:szCs w:val="28"/>
+        </w:rPr>
+        <w:drawing>
+          <wp:inline distT="0" distB="0" distL="0" distR="0" wp14:anchorId="2249C180" wp14:editId="029122F2">
+            <wp:extent cx="2647518" cy="171450"/>
+            <wp:effectExtent l="0" t="0" r="635" b="0"/>
+            <wp:docPr id="1031594752" name="Picture 1"/>
+            <wp:cNvGraphicFramePr>
+              <a:graphicFrameLocks xmlns:a="http://schemas.openxmlformats.org/drawingml/2006/main" noChangeAspect="1"/>
+            </wp:cNvGraphicFramePr>
+            <a:graphic xmlns:a="http://schemas.openxmlformats.org/drawingml/2006/main">
+              <a:graphicData uri="http://schemas.openxmlformats.org/drawingml/2006/picture">
+                <pic:pic xmlns:pic="http://schemas.openxmlformats.org/drawingml/2006/picture">
+                  <pic:nvPicPr>
+                    <pic:cNvPr id="1031594752" name=""/>
+                    <pic:cNvPicPr/>
+                  </pic:nvPicPr>
+                  <pic:blipFill rotWithShape="1">
+                    <a:blip r:embed="rId25"/>
+                    <a:srcRect t="23729" b="-1"/>
+                    <a:stretch>
+                      <a:fillRect/>
+                    </a:stretch>
+                  </pic:blipFill>
+                  <pic:spPr bwMode="auto">
+                    <a:xfrm>
+                      <a:off x="0" y="0"/>
+                      <a:ext cx="2679954" cy="173551"/>
+                    </a:xfrm>
+                    <a:prstGeom prst="rect">
+                      <a:avLst/>
+                    </a:prstGeom>
+                    <a:ln>
+                      <a:noFill/>
+                    </a:ln>
+                    <a:extLst>
+                      <a:ext uri="{53640926-AAD7-44D8-BBD7-CCE9431645EC}">
+                        <a14:shadowObscured xmlns:a14="http://schemas.microsoft.com/office/drawing/2010/main"/>
+                      </a:ext>
+                    </a:extLst>
+                  </pic:spPr>
+                </pic:pic>
+              </a:graphicData>
+            </a:graphic>
+          </wp:inline>
+        </w:drawing>
+      </w:r>
+    </w:p>
+    <w:p>
+      <w:pPr>
+        <w:rPr>
+          <w:rFonts w:asciiTheme="majorBidi" w:hAnsiTheme="majorBidi" w:cstheme="majorBidi"/>
+          <w:sz w:val="28"/>
+          <w:szCs w:val="28"/>
+        </w:rPr>
+      </w:pPr>
+      <w:r>
+        <w:rPr>
+          <w:rFonts w:asciiTheme="majorBidi" w:hAnsiTheme="majorBidi" w:cstheme="majorBidi"/>
+          <w:noProof/>
+          <w:sz w:val="28"/>
+          <w:szCs w:val="28"/>
+        </w:rPr>
+        <w:drawing>
+          <wp:inline distT="0" distB="0" distL="0" distR="0" wp14:anchorId="14F6506B" wp14:editId="4877DCAF">
+            <wp:extent cx="4323177" cy="3566160"/>
+            <wp:effectExtent l="0" t="0" r="1270" b="0"/>
+            <wp:docPr id="225014205" name="Picture 1"/>
+            <wp:cNvGraphicFramePr>
+              <a:graphicFrameLocks xmlns:a="http://schemas.openxmlformats.org/drawingml/2006/main" noChangeAspect="1"/>
+            </wp:cNvGraphicFramePr>
+            <a:graphic xmlns:a="http://schemas.openxmlformats.org/drawingml/2006/main">
+              <a:graphicData uri="http://schemas.openxmlformats.org/drawingml/2006/picture">
+                <pic:pic xmlns:pic="http://schemas.openxmlformats.org/drawingml/2006/picture">
+                  <pic:nvPicPr>
+                    <pic:cNvPr id="225014205" name=""/>
+                    <pic:cNvPicPr/>
+                  </pic:nvPicPr>
+                  <pic:blipFill>
+                    <a:blip r:embed="rId26"/>
+                    <a:stretch>
+                      <a:fillRect/>
+                    </a:stretch>
+                  </pic:blipFill>
+                  <pic:spPr>
+                    <a:xfrm>
+                      <a:off x="0" y="0"/>
+                      <a:ext cx="4327383" cy="3569630"/>
+                    </a:xfrm>
+                    <a:prstGeom prst="rect">
+                      <a:avLst/>
+                    </a:prstGeom>
+                  </pic:spPr>
+                </pic:pic>
+              </a:graphicData>
+            </a:graphic>
+          </wp:inline>
+        </w:drawing>
+      </w:r>
+    </w:p>
+    <w:p>
+      <w:pPr>
+        <w:rPr>
+          <w:rFonts w:asciiTheme="majorBidi" w:hAnsiTheme="majorBidi" w:cstheme="majorBidi"/>
+          <w:sz w:val="28"/>
+          <w:szCs w:val="28"/>
+        </w:rPr>
+      </w:pPr>
+      <w:r>
+        <w:rPr>
+          <w:rFonts w:asciiTheme="majorBidi" w:hAnsiTheme="majorBidi" w:cstheme="majorBidi"/>
+          <w:noProof/>
+          <w:sz w:val="28"/>
+          <w:szCs w:val="28"/>
+        </w:rPr>
+        <w:drawing>
+          <wp:inline distT="0" distB="0" distL="0" distR="0" wp14:anchorId="3959FED1" wp14:editId="4C915837">
+            <wp:extent cx="3345180" cy="244456"/>
+            <wp:effectExtent l="0" t="0" r="0" b="3810"/>
+            <wp:docPr id="906012331" name="Picture 1"/>
+            <wp:cNvGraphicFramePr>
+              <a:graphicFrameLocks xmlns:a="http://schemas.openxmlformats.org/drawingml/2006/main" noChangeAspect="1"/>
+            </wp:cNvGraphicFramePr>
+            <a:graphic xmlns:a="http://schemas.openxmlformats.org/drawingml/2006/main">
+              <a:graphicData uri="http://schemas.openxmlformats.org/drawingml/2006/picture">
+                <pic:pic xmlns:pic="http://schemas.openxmlformats.org/drawingml/2006/picture">
+                  <pic:nvPicPr>
+                    <pic:cNvPr id="906012331" name=""/>
+                    <pic:cNvPicPr/>
+                  </pic:nvPicPr>
+                  <pic:blipFill>
+                    <a:blip r:embed="rId27"/>
+                    <a:stretch>
+                      <a:fillRect/>
+                    </a:stretch>
+                  </pic:blipFill>
+                  <pic:spPr>
+                    <a:xfrm>
+                      <a:off x="0" y="0"/>
+                      <a:ext cx="3590965" cy="262417"/>
+                    </a:xfrm>
+                    <a:prstGeom prst="rect">
+                      <a:avLst/>
+                    </a:prstGeom>
+                  </pic:spPr>
+                </pic:pic>
+              </a:graphicData>
+            </a:graphic>
+          </wp:inline>
+        </w:drawing>
+      </w:r>
+    </w:p>
+    <w:p>
+      <w:pPr>
+        <w:rPr>
+          <w:rFonts w:asciiTheme="majorBidi" w:hAnsiTheme="majorBidi" w:cstheme="majorBidi"/>
+          <w:sz w:val="28"/>
+          <w:szCs w:val="28"/>
+        </w:rPr>
+      </w:pPr>
+      <w:r>
+        <w:rPr>
+          <w:rFonts w:asciiTheme="majorBidi" w:hAnsiTheme="majorBidi" w:cstheme="majorBidi"/>
+          <w:sz w:val="28"/>
+          <w:szCs w:val="28"/>
+        </w:rPr>
+        <w:t xml:space="preserve">Now </w:t>
+      </w:r>
+      <w:r>
+        <w:rPr>
+          <w:rFonts w:asciiTheme="majorBidi" w:hAnsiTheme="majorBidi" w:cstheme="majorBidi"/>
+          <w:b/>
+          <w:bCs/>
+          <w:sz w:val="28"/>
+          <w:szCs w:val="28"/>
+        </w:rPr>
+        <w:t>ecg100_final</w:t>
+      </w:r>
+      <w:r>
+        <w:rPr>
+          <w:rFonts w:asciiTheme="majorBidi" w:hAnsiTheme="majorBidi" w:cstheme="majorBidi"/>
+          <w:sz w:val="28"/>
+          <w:szCs w:val="28"/>
+        </w:rPr>
+        <w:t xml:space="preserve"> and </w:t>
+      </w:r>
+      <w:r>
+        <w:rPr>
+          <w:rFonts w:asciiTheme="majorBidi" w:hAnsiTheme="majorBidi" w:cstheme="majorBidi"/>
+          <w:b/>
+          <w:bCs/>
+          <w:sz w:val="28"/>
+          <w:szCs w:val="28"/>
+        </w:rPr>
+        <w:t>ecg106_final</w:t>
+      </w:r>
+      <w:r>
+        <w:rPr>
+          <w:rFonts w:asciiTheme="majorBidi" w:hAnsiTheme="majorBidi" w:cstheme="majorBidi"/>
+          <w:sz w:val="28"/>
+          <w:szCs w:val="28"/>
+        </w:rPr>
+        <w:t xml:space="preserve"> include the filtered output signals for both Record 100 and Record 106 respectively.</w:t>
+      </w:r>
+    </w:p>
+    <w:p>
+      <w:pPr>
+        <w:rPr>
+          <w:rFonts w:asciiTheme="majorBidi" w:hAnsiTheme="majorBidi" w:cstheme="majorBidi"/>
+          <w:sz w:val="28"/>
+          <w:szCs w:val="28"/>
+        </w:rPr>
+      </w:pPr>
+      <w:r>
+        <w:rPr>
+          <w:rFonts w:asciiTheme="majorBidi" w:hAnsiTheme="majorBidi" w:cstheme="majorBidi"/>
+          <w:sz w:val="28"/>
+          <w:szCs w:val="28"/>
+        </w:rPr>
+        <w:t>The continuation of the MATLAB code below begins plotting all comparison plots and graphs for analysis and validation.</w:t>
+      </w:r>
+    </w:p>
+    <w:p>
+      <w:pPr>
+        <w:rPr>
+          <w:rFonts w:asciiTheme="majorBidi" w:hAnsiTheme="majorBidi" w:cstheme="majorBidi"/>
+          <w:sz w:val="28"/>
+          <w:szCs w:val="28"/>
+        </w:rPr>
+      </w:pPr>
+      <w:r>
+        <w:rPr>
+          <w:rFonts w:asciiTheme="majorBidi" w:hAnsiTheme="majorBidi" w:cstheme="majorBidi"/>
+          <w:noProof/>
+          <w:sz w:val="28"/>
+          <w:szCs w:val="28"/>
+        </w:rPr>
+        <w:lastRenderedPageBreak/>
+        <w:drawing>
+          <wp:inline distT="0" distB="0" distL="0" distR="0" wp14:anchorId="7EF209F9" wp14:editId="2675870D">
+            <wp:extent cx="4287616" cy="5036820"/>
+            <wp:effectExtent l="0" t="0" r="0" b="0"/>
+            <wp:docPr id="1368632068" name="Picture 1"/>
+            <wp:cNvGraphicFramePr>
+              <a:graphicFrameLocks xmlns:a="http://schemas.openxmlformats.org/drawingml/2006/main" noChangeAspect="1"/>
+            </wp:cNvGraphicFramePr>
+            <a:graphic xmlns:a="http://schemas.openxmlformats.org/drawingml/2006/main">
+              <a:graphicData uri="http://schemas.openxmlformats.org/drawingml/2006/picture">
+                <pic:pic xmlns:pic="http://schemas.openxmlformats.org/drawingml/2006/picture">
+                  <pic:nvPicPr>
+                    <pic:cNvPr id="1368632068" name=""/>
+                    <pic:cNvPicPr/>
+                  </pic:nvPicPr>
+                  <pic:blipFill rotWithShape="1">
+                    <a:blip r:embed="rId28"/>
+                    <a:srcRect l="1263" t="5726" r="-1263" b="296"/>
+                    <a:stretch>
+                      <a:fillRect/>
+                    </a:stretch>
+                  </pic:blipFill>
+                  <pic:spPr bwMode="auto">
+                    <a:xfrm>
+                      <a:off x="0" y="0"/>
+                      <a:ext cx="4295585" cy="5046182"/>
+                    </a:xfrm>
+                    <a:prstGeom prst="rect">
+                      <a:avLst/>
+                    </a:prstGeom>
+                    <a:ln>
+                      <a:noFill/>
+                    </a:ln>
+                    <a:extLst>
+                      <a:ext uri="{53640926-AAD7-44D8-BBD7-CCE9431645EC}">
+                        <a14:shadowObscured xmlns:a14="http://schemas.microsoft.com/office/drawing/2010/main"/>
+                      </a:ext>
+                    </a:extLst>
+                  </pic:spPr>
+                </pic:pic>
+              </a:graphicData>
+            </a:graphic>
+          </wp:inline>
+        </w:drawing>
+      </w:r>
+    </w:p>
+    <w:p>
+      <w:pPr>
+        <w:rPr>
+          <w:rFonts w:asciiTheme="majorBidi" w:hAnsiTheme="majorBidi" w:cstheme="majorBidi"/>
+          <w:sz w:val="28"/>
+          <w:szCs w:val="28"/>
+        </w:rPr>
+      </w:pPr>
+      <w:r>
+        <w:rPr>
+          <w:rFonts w:asciiTheme="majorBidi" w:hAnsiTheme="majorBidi" w:cstheme="majorBidi"/>
+          <w:noProof/>
+          <w:sz w:val="28"/>
+          <w:szCs w:val="28"/>
+        </w:rPr>
+        <w:drawing>
+          <wp:inline distT="0" distB="0" distL="0" distR="0" wp14:anchorId="05CABF4A" wp14:editId="4E192AE3">
+            <wp:extent cx="3232923" cy="2758440"/>
+            <wp:effectExtent l="0" t="0" r="5715" b="3810"/>
+            <wp:docPr id="1849197545" name="Picture 1"/>
+            <wp:cNvGraphicFramePr>
+              <a:graphicFrameLocks xmlns:a="http://schemas.openxmlformats.org/drawingml/2006/main" noChangeAspect="1"/>
+            </wp:cNvGraphicFramePr>
+            <a:graphic xmlns:a="http://schemas.openxmlformats.org/drawingml/2006/main">
+              <a:graphicData uri="http://schemas.openxmlformats.org/drawingml/2006/picture">
+                <pic:pic xmlns:pic="http://schemas.openxmlformats.org/drawingml/2006/picture">
+                  <pic:nvPicPr>
+                    <pic:cNvPr id="1849197545" name=""/>
+                    <pic:cNvPicPr/>
+                  </pic:nvPicPr>
+                  <pic:blipFill>
+                    <a:blip r:embed="rId29"/>
+                    <a:stretch>
+                      <a:fillRect/>
+                    </a:stretch>
+                  </pic:blipFill>
+                  <pic:spPr>
+                    <a:xfrm>
+                      <a:off x="0" y="0"/>
+                      <a:ext cx="3240211" cy="2764659"/>
+                    </a:xfrm>
+                    <a:prstGeom prst="rect">
+                      <a:avLst/>
+                    </a:prstGeom>
+                  </pic:spPr>
+                </pic:pic>
+              </a:graphicData>
+            </a:graphic>
+          </wp:inline>
+        </w:drawing>
+      </w:r>
+    </w:p>
+    <w:p>
+      <w:pPr>
+        <w:rPr>
+          <w:rFonts w:asciiTheme="majorBidi" w:hAnsiTheme="majorBidi" w:cstheme="majorBidi"/>
+          <w:sz w:val="28"/>
+          <w:szCs w:val="28"/>
+        </w:rPr>
+      </w:pPr>
+      <w:r>
+        <w:rPr>
+          <w:rFonts w:asciiTheme="majorBidi" w:hAnsiTheme="majorBidi" w:cstheme="majorBidi"/>
+          <w:noProof/>
+          <w:sz w:val="28"/>
+          <w:szCs w:val="28"/>
+        </w:rPr>
+        <w:lastRenderedPageBreak/>
+        <w:drawing>
+          <wp:inline distT="0" distB="0" distL="0" distR="0" wp14:anchorId="368F185D" wp14:editId="2AA66FB8">
+            <wp:extent cx="5237639" cy="3147060"/>
+            <wp:effectExtent l="0" t="0" r="1270" b="0"/>
+            <wp:docPr id="1589294922" name="Picture 1"/>
+            <wp:cNvGraphicFramePr>
+              <a:graphicFrameLocks xmlns:a="http://schemas.openxmlformats.org/drawingml/2006/main" noChangeAspect="1"/>
+            </wp:cNvGraphicFramePr>
+            <a:graphic xmlns:a="http://schemas.openxmlformats.org/drawingml/2006/main">
+              <a:graphicData uri="http://schemas.openxmlformats.org/drawingml/2006/picture">
+                <pic:pic xmlns:pic="http://schemas.openxmlformats.org/drawingml/2006/picture">
+                  <pic:nvPicPr>
+                    <pic:cNvPr id="1589294922" name=""/>
+                    <pic:cNvPicPr/>
+                  </pic:nvPicPr>
+                  <pic:blipFill>
+                    <a:blip r:embed="rId30"/>
+                    <a:stretch>
+                      <a:fillRect/>
+                    </a:stretch>
+                  </pic:blipFill>
+                  <pic:spPr>
+                    <a:xfrm>
+                      <a:off x="0" y="0"/>
+                      <a:ext cx="5250400" cy="3154728"/>
+                    </a:xfrm>
+                    <a:prstGeom prst="rect">
+                      <a:avLst/>
+                    </a:prstGeom>
+                  </pic:spPr>
+                </pic:pic>
+              </a:graphicData>
+            </a:graphic>
+          </wp:inline>
+        </w:drawing>
+      </w:r>
+    </w:p>
+    <w:p>
+      <w:pPr>
+        <w:rPr>
+          <w:rFonts w:asciiTheme="majorBidi" w:hAnsiTheme="majorBidi" w:cstheme="majorBidi"/>
+          <w:sz w:val="28"/>
+          <w:szCs w:val="28"/>
+        </w:rPr>
+      </w:pPr>
+      <w:r>
+        <w:rPr>
+          <w:rFonts w:ascii="Century Schoolbook" w:hAnsi="Century Schoolbook"/>
+          <w:noProof/>
+          <w:sz w:val="16"/>
+          <w:szCs w:val="16"/>
+        </w:rPr>
+        <w:drawing>
+          <wp:inline distT="0" distB="0" distL="0" distR="0" wp14:anchorId="4E18A7B5" wp14:editId="22E697A2">
+            <wp:extent cx="5943600" cy="3345180"/>
+            <wp:effectExtent l="0" t="0" r="0" b="7620"/>
+            <wp:docPr id="341190385" name="Picture 1"/>
+            <wp:cNvGraphicFramePr>
+              <a:graphicFrameLocks xmlns:a="http://schemas.openxmlformats.org/drawingml/2006/main" noChangeAspect="1"/>
+            </wp:cNvGraphicFramePr>
+            <a:graphic xmlns:a="http://schemas.openxmlformats.org/drawingml/2006/main">
+              <a:graphicData uri="http://schemas.openxmlformats.org/drawingml/2006/picture">
+                <pic:pic xmlns:pic="http://schemas.openxmlformats.org/drawingml/2006/picture">
+                  <pic:nvPicPr>
+                    <pic:cNvPr id="341190385" name=""/>
+                    <pic:cNvPicPr/>
+                  </pic:nvPicPr>
+                  <pic:blipFill>
+                    <a:blip r:embed="rId31"/>
+                    <a:stretch>
+                      <a:fillRect/>
+                    </a:stretch>
+                  </pic:blipFill>
+                  <pic:spPr>
+                    <a:xfrm>
+                      <a:off x="0" y="0"/>
+                      <a:ext cx="5945697" cy="3346360"/>
+                    </a:xfrm>
+                    <a:prstGeom prst="rect">
+                      <a:avLst/>
+                    </a:prstGeom>
+                  </pic:spPr>
+                </pic:pic>
+              </a:graphicData>
+            </a:graphic>
+          </wp:inline>
+        </w:drawing>
+      </w:r>
+    </w:p>
+    <w:p>
+      <w:pPr>
+        <w:ind w:left="1276" w:firstLine="1559"/>
+        <w:jc w:val="both"/>
+        <w:rPr>
+          <w:rFonts w:ascii="Century Schoolbook" w:hAnsi="Century Schoolbook"/>
+          <w:sz w:val="16"/>
+          <w:szCs w:val="16"/>
+        </w:rPr>
+      </w:pPr>
+      <w:r>
+        <w:rPr>
+          <w:rFonts w:ascii="Century Schoolbook" w:hAnsi="Century Schoolbook"/>
+          <w:sz w:val="16"/>
+          <w:szCs w:val="16"/>
+        </w:rPr>
+        <w:t xml:space="preserve">Fig </w:t>
+      </w:r>
+      <w:r>
+        <w:rPr>
+          <w:rFonts w:ascii="Century Schoolbook" w:hAnsi="Century Schoolbook"/>
+          <w:sz w:val="16"/>
+          <w:szCs w:val="16"/>
+        </w:rPr>
+        <w:t>3</w:t>
+      </w:r>
+      <w:r>
+        <w:rPr>
+          <w:rFonts w:ascii="Century Schoolbook" w:hAnsi="Century Schoolbook"/>
+          <w:sz w:val="16"/>
+          <w:szCs w:val="16"/>
+        </w:rPr>
+        <w:t>.</w:t>
+      </w:r>
+      <w:r>
+        <w:rPr>
+          <w:rFonts w:ascii="Century Schoolbook" w:hAnsi="Century Schoolbook"/>
+          <w:sz w:val="16"/>
+          <w:szCs w:val="16"/>
+        </w:rPr>
+        <w:t>1</w:t>
+      </w:r>
+      <w:r>
+        <w:rPr>
+          <w:rFonts w:ascii="Century Schoolbook" w:hAnsi="Century Schoolbook"/>
+          <w:sz w:val="16"/>
+          <w:szCs w:val="16"/>
+        </w:rPr>
+        <w:t xml:space="preserve">: </w:t>
+      </w:r>
+      <w:r>
+        <w:rPr>
+          <w:rFonts w:ascii="Century Schoolbook" w:hAnsi="Century Schoolbook"/>
+          <w:sz w:val="16"/>
+          <w:szCs w:val="16"/>
+        </w:rPr>
+        <w:t>Before and after filtering signal plots</w:t>
+      </w:r>
+    </w:p>
+    <w:p>
+      <w:pPr>
+        <w:jc w:val="center"/>
+        <w:rPr>
+          <w:rFonts w:asciiTheme="majorBidi" w:hAnsiTheme="majorBidi" w:cstheme="majorBidi"/>
+          <w:sz w:val="28"/>
+          <w:szCs w:val="28"/>
+        </w:rPr>
+      </w:pPr>
+      <w:r>
+        <w:rPr>
+          <w:rFonts w:ascii="Century Schoolbook" w:hAnsi="Century Schoolbook"/>
+          <w:noProof/>
+          <w:sz w:val="16"/>
+          <w:szCs w:val="16"/>
+        </w:rPr>
+        <w:drawing>
+          <wp:inline distT="0" distB="0" distL="0" distR="0" wp14:anchorId="0353E345" wp14:editId="44427122">
+            <wp:extent cx="1927860" cy="603376"/>
+            <wp:effectExtent l="0" t="0" r="0" b="6350"/>
+            <wp:docPr id="1629839787" name="Picture 1"/>
+            <wp:cNvGraphicFramePr>
+              <a:graphicFrameLocks xmlns:a="http://schemas.openxmlformats.org/drawingml/2006/main" noChangeAspect="1"/>
+            </wp:cNvGraphicFramePr>
+            <a:graphic xmlns:a="http://schemas.openxmlformats.org/drawingml/2006/main">
+              <a:graphicData uri="http://schemas.openxmlformats.org/drawingml/2006/picture">
+                <pic:pic xmlns:pic="http://schemas.openxmlformats.org/drawingml/2006/picture">
+                  <pic:nvPicPr>
+                    <pic:cNvPr id="1629839787" name=""/>
+                    <pic:cNvPicPr/>
+                  </pic:nvPicPr>
+                  <pic:blipFill>
+                    <a:blip r:embed="rId32"/>
+                    <a:stretch>
+                      <a:fillRect/>
+                    </a:stretch>
+                  </pic:blipFill>
+                  <pic:spPr>
+                    <a:xfrm>
+                      <a:off x="0" y="0"/>
+                      <a:ext cx="1939381" cy="606982"/>
+                    </a:xfrm>
+                    <a:prstGeom prst="rect">
+                      <a:avLst/>
+                    </a:prstGeom>
+                  </pic:spPr>
+                </pic:pic>
+              </a:graphicData>
+            </a:graphic>
+          </wp:inline>
+        </w:drawing>
+      </w:r>
+    </w:p>
+    <w:p>
+      <w:pPr>
+        <w:ind w:left="1276" w:firstLine="1843"/>
+        <w:jc w:val="both"/>
+        <w:rPr>
+          <w:rFonts w:ascii="Century Schoolbook" w:hAnsi="Century Schoolbook"/>
+          <w:sz w:val="16"/>
+          <w:szCs w:val="16"/>
+        </w:rPr>
+      </w:pPr>
+      <w:r>
+        <w:rPr>
+          <w:rFonts w:ascii="Century Schoolbook" w:hAnsi="Century Schoolbook"/>
+          <w:sz w:val="16"/>
+          <w:szCs w:val="16"/>
+        </w:rPr>
+        <w:t xml:space="preserve">Fig </w:t>
+      </w:r>
+      <w:r>
+        <w:rPr>
+          <w:rFonts w:ascii="Century Schoolbook" w:hAnsi="Century Schoolbook"/>
+          <w:sz w:val="16"/>
+          <w:szCs w:val="16"/>
+        </w:rPr>
+        <w:t>3</w:t>
+      </w:r>
+      <w:r>
+        <w:rPr>
+          <w:rFonts w:ascii="Century Schoolbook" w:hAnsi="Century Schoolbook"/>
+          <w:sz w:val="16"/>
+          <w:szCs w:val="16"/>
+        </w:rPr>
+        <w:t>.</w:t>
+      </w:r>
+      <w:r>
+        <w:rPr>
+          <w:rFonts w:ascii="Century Schoolbook" w:hAnsi="Century Schoolbook"/>
+          <w:sz w:val="16"/>
+          <w:szCs w:val="16"/>
+        </w:rPr>
+        <w:t>2</w:t>
+      </w:r>
+      <w:r>
+        <w:rPr>
+          <w:rFonts w:ascii="Century Schoolbook" w:hAnsi="Century Schoolbook"/>
+          <w:sz w:val="16"/>
+          <w:szCs w:val="16"/>
+        </w:rPr>
+        <w:t xml:space="preserve">: </w:t>
+      </w:r>
+      <w:r>
+        <w:rPr>
+          <w:rFonts w:ascii="Century Schoolbook" w:hAnsi="Century Schoolbook"/>
+          <w:sz w:val="16"/>
+          <w:szCs w:val="16"/>
+        </w:rPr>
+        <w:t>SNR improvement print output</w:t>
+      </w:r>
+    </w:p>
+    <w:p>
+      <w:pPr>
+        <w:ind w:left="1276" w:hanging="1276"/>
+        <w:jc w:val="center"/>
+        <w:rPr>
+          <w:rFonts w:ascii="Century Schoolbook" w:hAnsi="Century Schoolbook"/>
+          <w:sz w:val="16"/>
+          <w:szCs w:val="16"/>
+        </w:rPr>
+      </w:pPr>
+      <w:r>
+        <w:rPr>
+          <w:rFonts w:ascii="Century Schoolbook" w:hAnsi="Century Schoolbook"/>
+          <w:noProof/>
+          <w:sz w:val="16"/>
+          <w:szCs w:val="16"/>
+        </w:rPr>
+        <w:lastRenderedPageBreak/>
+        <w:drawing>
+          <wp:inline distT="0" distB="0" distL="0" distR="0" wp14:anchorId="43FAFF7E" wp14:editId="0F2862F6">
+            <wp:extent cx="3854517" cy="3009900"/>
+            <wp:effectExtent l="0" t="0" r="0" b="0"/>
+            <wp:docPr id="2007307660" name="Picture 1"/>
+            <wp:cNvGraphicFramePr>
+              <a:graphicFrameLocks xmlns:a="http://schemas.openxmlformats.org/drawingml/2006/main" noChangeAspect="1"/>
+            </wp:cNvGraphicFramePr>
+            <a:graphic xmlns:a="http://schemas.openxmlformats.org/drawingml/2006/main">
+              <a:graphicData uri="http://schemas.openxmlformats.org/drawingml/2006/picture">
+                <pic:pic xmlns:pic="http://schemas.openxmlformats.org/drawingml/2006/picture">
+                  <pic:nvPicPr>
+                    <pic:cNvPr id="2007307660" name=""/>
+                    <pic:cNvPicPr/>
+                  </pic:nvPicPr>
+                  <pic:blipFill>
+                    <a:blip r:embed="rId33"/>
+                    <a:stretch>
+                      <a:fillRect/>
+                    </a:stretch>
+                  </pic:blipFill>
+                  <pic:spPr>
+                    <a:xfrm>
+                      <a:off x="0" y="0"/>
+                      <a:ext cx="3860020" cy="3014197"/>
+                    </a:xfrm>
+                    <a:prstGeom prst="rect">
+                      <a:avLst/>
+                    </a:prstGeom>
+                  </pic:spPr>
+                </pic:pic>
+              </a:graphicData>
+            </a:graphic>
+          </wp:inline>
+        </w:drawing>
+      </w:r>
+    </w:p>
+    <w:p>
+      <w:pPr>
+        <w:ind w:left="1276" w:firstLine="1843"/>
+        <w:jc w:val="both"/>
+        <w:rPr>
+          <w:rFonts w:ascii="Century Schoolbook" w:hAnsi="Century Schoolbook"/>
+          <w:sz w:val="16"/>
+          <w:szCs w:val="16"/>
+        </w:rPr>
+      </w:pPr>
+      <w:r>
+        <w:rPr>
+          <w:rFonts w:ascii="Century Schoolbook" w:hAnsi="Century Schoolbook"/>
+          <w:sz w:val="16"/>
+          <w:szCs w:val="16"/>
+        </w:rPr>
+        <w:t xml:space="preserve">Fig </w:t>
+      </w:r>
+      <w:r>
+        <w:rPr>
+          <w:rFonts w:ascii="Century Schoolbook" w:hAnsi="Century Schoolbook"/>
+          <w:sz w:val="16"/>
+          <w:szCs w:val="16"/>
+        </w:rPr>
+        <w:t>3</w:t>
+      </w:r>
+      <w:r>
+        <w:rPr>
+          <w:rFonts w:ascii="Century Schoolbook" w:hAnsi="Century Schoolbook"/>
+          <w:sz w:val="16"/>
+          <w:szCs w:val="16"/>
+        </w:rPr>
+        <w:t>.</w:t>
+      </w:r>
+      <w:r>
+        <w:rPr>
+          <w:rFonts w:ascii="Century Schoolbook" w:hAnsi="Century Schoolbook"/>
+          <w:sz w:val="16"/>
+          <w:szCs w:val="16"/>
+        </w:rPr>
+        <w:t>3</w:t>
+      </w:r>
+      <w:r>
+        <w:rPr>
+          <w:rFonts w:ascii="Century Schoolbook" w:hAnsi="Century Schoolbook"/>
+          <w:sz w:val="16"/>
+          <w:szCs w:val="16"/>
+        </w:rPr>
+        <w:t xml:space="preserve">: </w:t>
+      </w:r>
+      <w:r>
+        <w:rPr>
+          <w:rFonts w:ascii="Century Schoolbook" w:hAnsi="Century Schoolbook"/>
+          <w:sz w:val="16"/>
+          <w:szCs w:val="16"/>
+        </w:rPr>
+        <w:t>Spectrogram of both output signals</w:t>
+      </w:r>
+    </w:p>
+    <w:p>
+      <w:pPr>
+        <w:ind w:left="1276" w:hanging="1276"/>
+        <w:jc w:val="center"/>
+        <w:rPr>
+          <w:rFonts w:ascii="Century Schoolbook" w:hAnsi="Century Schoolbook"/>
+          <w:sz w:val="16"/>
+          <w:szCs w:val="16"/>
+        </w:rPr>
+      </w:pPr>
+      <w:r>
+        <w:rPr>
+          <w:rFonts w:ascii="Century Schoolbook" w:hAnsi="Century Schoolbook"/>
+          <w:noProof/>
+          <w:sz w:val="16"/>
+          <w:szCs w:val="16"/>
+        </w:rPr>
+        <w:drawing>
+          <wp:inline distT="0" distB="0" distL="0" distR="0" wp14:anchorId="1B693735" wp14:editId="2E77BCCE">
+            <wp:extent cx="3888301" cy="2621280"/>
+            <wp:effectExtent l="0" t="0" r="0" b="7620"/>
+            <wp:docPr id="434195165" name="Picture 1"/>
+            <wp:cNvGraphicFramePr>
+              <a:graphicFrameLocks xmlns:a="http://schemas.openxmlformats.org/drawingml/2006/main" noChangeAspect="1"/>
+            </wp:cNvGraphicFramePr>
+            <a:graphic xmlns:a="http://schemas.openxmlformats.org/drawingml/2006/main">
+              <a:graphicData uri="http://schemas.openxmlformats.org/drawingml/2006/picture">
+                <pic:pic xmlns:pic="http://schemas.openxmlformats.org/drawingml/2006/picture">
+                  <pic:nvPicPr>
+                    <pic:cNvPr id="434195165" name=""/>
+                    <pic:cNvPicPr/>
+                  </pic:nvPicPr>
+                  <pic:blipFill>
+                    <a:blip r:embed="rId34"/>
+                    <a:stretch>
+                      <a:fillRect/>
+                    </a:stretch>
+                  </pic:blipFill>
+                  <pic:spPr>
+                    <a:xfrm>
+                      <a:off x="0" y="0"/>
+                      <a:ext cx="3895215" cy="2625941"/>
+                    </a:xfrm>
+                    <a:prstGeom prst="rect">
+                      <a:avLst/>
+                    </a:prstGeom>
+                  </pic:spPr>
+                </pic:pic>
+              </a:graphicData>
+            </a:graphic>
+          </wp:inline>
+        </w:drawing>
+      </w:r>
+    </w:p>
+    <w:p>
+      <w:pPr>
+        <w:ind w:left="1276" w:firstLine="1418"/>
+        <w:jc w:val="both"/>
+        <w:rPr>
+          <w:rFonts w:ascii="Century Schoolbook" w:hAnsi="Century Schoolbook"/>
+          <w:sz w:val="16"/>
+          <w:szCs w:val="16"/>
+        </w:rPr>
+      </w:pPr>
+      <w:r>
+        <w:rPr>
+          <w:rFonts w:ascii="Century Schoolbook" w:hAnsi="Century Schoolbook"/>
+          <w:sz w:val="16"/>
+          <w:szCs w:val="16"/>
+        </w:rPr>
+        <w:t xml:space="preserve">Fig </w:t>
+      </w:r>
+      <w:r>
+        <w:rPr>
+          <w:rFonts w:ascii="Century Schoolbook" w:hAnsi="Century Schoolbook"/>
+          <w:sz w:val="16"/>
+          <w:szCs w:val="16"/>
+        </w:rPr>
+        <w:t>3</w:t>
+      </w:r>
+      <w:r>
+        <w:rPr>
+          <w:rFonts w:ascii="Century Schoolbook" w:hAnsi="Century Schoolbook"/>
+          <w:sz w:val="16"/>
+          <w:szCs w:val="16"/>
+        </w:rPr>
+        <w:t>.</w:t>
+      </w:r>
+      <w:r>
+        <w:rPr>
+          <w:rFonts w:ascii="Century Schoolbook" w:hAnsi="Century Schoolbook"/>
+          <w:sz w:val="16"/>
+          <w:szCs w:val="16"/>
+        </w:rPr>
+        <w:t>4</w:t>
+      </w:r>
+      <w:r>
+        <w:rPr>
+          <w:rFonts w:ascii="Century Schoolbook" w:hAnsi="Century Schoolbook"/>
+          <w:sz w:val="16"/>
+          <w:szCs w:val="16"/>
+        </w:rPr>
+        <w:t xml:space="preserve">: </w:t>
+      </w:r>
+      <w:r>
+        <w:rPr>
+          <w:rFonts w:ascii="Century Schoolbook" w:hAnsi="Century Schoolbook"/>
+          <w:sz w:val="16"/>
+          <w:szCs w:val="16"/>
+        </w:rPr>
+        <w:t>Power Spectral Density of both output signals</w:t>
       </w:r>
     </w:p>
     <w:p>

</xml_diff>

<commit_message>
add section 3 discussion
</commit_message>
<xml_diff>
--- a/part-1/part_1_report.docx
+++ b/part-1/part_1_report.docx
@@ -243,7 +243,25 @@
           <w:sz w:val="36"/>
           <w:szCs w:val="36"/>
         </w:rPr>
-        <w:t xml:space="preserve">Mazen Elkaslan (G2 S1) </w:t>
+        <w:t xml:space="preserve">Mazen </w:t>
+      </w:r>
+      <w:proofErr w:type="spellStart"/>
+      <w:r>
+        <w:rPr>
+          <w:rFonts w:asciiTheme="majorBidi" w:hAnsiTheme="majorBidi" w:cstheme="majorBidi"/>
+          <w:sz w:val="36"/>
+          <w:szCs w:val="36"/>
+        </w:rPr>
+        <w:t>Elkaslan</w:t>
+      </w:r>
+      <w:proofErr w:type="spellEnd"/>
+      <w:r>
+        <w:rPr>
+          <w:rFonts w:asciiTheme="majorBidi" w:hAnsiTheme="majorBidi" w:cstheme="majorBidi"/>
+          <w:sz w:val="36"/>
+          <w:szCs w:val="36"/>
+        </w:rPr>
+        <w:t xml:space="preserve"> (G2 S1) </w:t>
       </w:r>
       <w:r>
         <w:rPr>
@@ -5623,7 +5641,25 @@
           <w:sz w:val="28"/>
           <w:szCs w:val="28"/>
         </w:rPr>
-        <w:t>e cascaded filters, and display a few comparison plots to prove the filters effects and the output signals:</w:t>
+        <w:t xml:space="preserve">e cascaded filters, and display a few comparison plots to prove the </w:t>
+      </w:r>
+      <w:proofErr w:type="gramStart"/>
+      <w:r>
+        <w:rPr>
+          <w:rFonts w:asciiTheme="majorBidi" w:hAnsiTheme="majorBidi" w:cstheme="majorBidi"/>
+          <w:sz w:val="28"/>
+          <w:szCs w:val="28"/>
+        </w:rPr>
+        <w:t>filters effects</w:t>
+      </w:r>
+      <w:proofErr w:type="gramEnd"/>
+      <w:r>
+        <w:rPr>
+          <w:rFonts w:asciiTheme="majorBidi" w:hAnsiTheme="majorBidi" w:cstheme="majorBidi"/>
+          <w:sz w:val="28"/>
+          <w:szCs w:val="28"/>
+        </w:rPr>
+        <w:t xml:space="preserve"> and the output signals:</w:t>
       </w:r>
     </w:p>
     <w:p>
@@ -6622,28 +6658,323 @@
     </w:p>
     <w:p>
       <w:pPr>
+        <w:jc w:val="both"/>
+        <w:rPr>
+          <w:rFonts w:asciiTheme="majorBidi" w:hAnsiTheme="majorBidi" w:cstheme="majorBidi"/>
+          <w:sz w:val="28"/>
+          <w:szCs w:val="28"/>
+        </w:rPr>
+      </w:pPr>
+      <w:r>
+        <w:rPr>
+          <w:rFonts w:asciiTheme="majorBidi" w:hAnsiTheme="majorBidi" w:cstheme="majorBidi"/>
+          <w:sz w:val="28"/>
+          <w:szCs w:val="28"/>
+        </w:rPr>
+        <w:t>As shown in Figure 3.1, the signal baseline for both filtered signals is now centered at 0mV. This is proof that the low frequency DC offset was successfully removed by the high-pass filter.</w:t>
+      </w:r>
+    </w:p>
+    <w:p>
+      <w:pPr>
+        <w:jc w:val="both"/>
+        <w:rPr>
+          <w:rFonts w:asciiTheme="majorBidi" w:hAnsiTheme="majorBidi" w:cstheme="majorBidi"/>
+          <w:sz w:val="28"/>
+          <w:szCs w:val="28"/>
+        </w:rPr>
+      </w:pPr>
+      <w:r>
+        <w:rPr>
+          <w:rFonts w:asciiTheme="majorBidi" w:hAnsiTheme="majorBidi" w:cstheme="majorBidi"/>
+          <w:sz w:val="28"/>
+          <w:szCs w:val="28"/>
+        </w:rPr>
+        <w:t>Noticing the deep line dive that occurs at exactly 50Hz in both signals in the power spectral density diagrams</w:t>
+      </w:r>
+      <w:proofErr w:type="gramStart"/>
+      <w:r>
+        <w:rPr>
+          <w:rFonts w:asciiTheme="majorBidi" w:hAnsiTheme="majorBidi" w:cstheme="majorBidi"/>
+          <w:sz w:val="28"/>
+          <w:szCs w:val="28"/>
+        </w:rPr>
+        <w:t>, that</w:t>
+      </w:r>
+      <w:proofErr w:type="gramEnd"/>
+      <w:r>
+        <w:rPr>
+          <w:rFonts w:asciiTheme="majorBidi" w:hAnsiTheme="majorBidi" w:cstheme="majorBidi"/>
+          <w:sz w:val="28"/>
+          <w:szCs w:val="28"/>
+        </w:rPr>
+        <w:t xml:space="preserve"> concludes that the power interference we discussed above has been successfully removed by the notch filter.</w:t>
+      </w:r>
+    </w:p>
+    <w:p>
+      <w:pPr>
+        <w:jc w:val="both"/>
+        <w:rPr>
+          <w:rFonts w:asciiTheme="majorBidi" w:hAnsiTheme="majorBidi" w:cstheme="majorBidi"/>
+          <w:sz w:val="28"/>
+          <w:szCs w:val="28"/>
+        </w:rPr>
+      </w:pPr>
+      <w:r>
+        <w:rPr>
+          <w:rFonts w:asciiTheme="majorBidi" w:hAnsiTheme="majorBidi" w:cstheme="majorBidi"/>
+          <w:sz w:val="28"/>
+          <w:szCs w:val="28"/>
+        </w:rPr>
+        <w:lastRenderedPageBreak/>
+        <w:t xml:space="preserve">Now you might notice that in the filtered signals, the noise within the flat segments has not been removed completely. That might lead to the question of whether the signal never </w:t>
+      </w:r>
+      <w:proofErr w:type="gramStart"/>
+      <w:r>
+        <w:rPr>
+          <w:rFonts w:asciiTheme="majorBidi" w:hAnsiTheme="majorBidi" w:cstheme="majorBidi"/>
+          <w:sz w:val="28"/>
+          <w:szCs w:val="28"/>
+        </w:rPr>
+        <w:t>had noise</w:t>
+      </w:r>
+      <w:proofErr w:type="gramEnd"/>
+      <w:r>
+        <w:rPr>
+          <w:rFonts w:asciiTheme="majorBidi" w:hAnsiTheme="majorBidi" w:cstheme="majorBidi"/>
+          <w:sz w:val="28"/>
+          <w:szCs w:val="28"/>
+        </w:rPr>
+        <w:t xml:space="preserve"> as we thought it did or that the filter never did work, but there is proof that the low-pass filter did </w:t>
+      </w:r>
+      <w:proofErr w:type="gramStart"/>
+      <w:r>
+        <w:rPr>
+          <w:rFonts w:asciiTheme="majorBidi" w:hAnsiTheme="majorBidi" w:cstheme="majorBidi"/>
+          <w:sz w:val="28"/>
+          <w:szCs w:val="28"/>
+        </w:rPr>
+        <w:t>actually work</w:t>
+      </w:r>
+      <w:proofErr w:type="gramEnd"/>
+      <w:r>
+        <w:rPr>
+          <w:rFonts w:asciiTheme="majorBidi" w:hAnsiTheme="majorBidi" w:cstheme="majorBidi"/>
+          <w:sz w:val="28"/>
+          <w:szCs w:val="28"/>
+        </w:rPr>
+        <w:t>.</w:t>
+      </w:r>
+    </w:p>
+    <w:p>
+      <w:pPr>
+        <w:jc w:val="both"/>
+        <w:rPr>
+          <w:rFonts w:asciiTheme="majorBidi" w:hAnsiTheme="majorBidi" w:cstheme="majorBidi"/>
+          <w:sz w:val="28"/>
+          <w:szCs w:val="28"/>
+        </w:rPr>
+      </w:pPr>
+      <w:r>
+        <w:rPr>
+          <w:rFonts w:asciiTheme="majorBidi" w:hAnsiTheme="majorBidi" w:cstheme="majorBidi"/>
+          <w:sz w:val="28"/>
+          <w:szCs w:val="28"/>
+        </w:rPr>
+        <w:t>Look at Figure 3.3, the bright yellow vertical lines, which represent the heartbeats, are still bright and sharp. This means the signal was never distorted, and the areas between 100Hz and 180Hz have signs of noise removal.</w:t>
+      </w:r>
+    </w:p>
+    <w:p>
+      <w:pPr>
+        <w:jc w:val="both"/>
+        <w:rPr>
+          <w:rFonts w:asciiTheme="majorBidi" w:hAnsiTheme="majorBidi" w:cstheme="majorBidi"/>
+          <w:sz w:val="28"/>
+          <w:szCs w:val="28"/>
+        </w:rPr>
+      </w:pPr>
+      <w:r>
+        <w:rPr>
+          <w:rFonts w:asciiTheme="majorBidi" w:hAnsiTheme="majorBidi" w:cstheme="majorBidi"/>
+          <w:sz w:val="28"/>
+          <w:szCs w:val="28"/>
+        </w:rPr>
+        <w:t>Figure 3.4</w:t>
+      </w:r>
+      <w:r>
+        <w:rPr>
+          <w:rFonts w:asciiTheme="majorBidi" w:hAnsiTheme="majorBidi" w:cstheme="majorBidi"/>
+          <w:sz w:val="28"/>
+          <w:szCs w:val="28"/>
+        </w:rPr>
+        <w:t xml:space="preserve"> show</w:t>
+      </w:r>
+      <w:r>
+        <w:rPr>
+          <w:rFonts w:asciiTheme="majorBidi" w:hAnsiTheme="majorBidi" w:cstheme="majorBidi"/>
+          <w:sz w:val="28"/>
+          <w:szCs w:val="28"/>
+        </w:rPr>
+        <w:t>s</w:t>
+      </w:r>
+      <w:r>
+        <w:rPr>
+          <w:rFonts w:asciiTheme="majorBidi" w:hAnsiTheme="majorBidi" w:cstheme="majorBidi"/>
+          <w:sz w:val="28"/>
+          <w:szCs w:val="28"/>
+        </w:rPr>
+        <w:t xml:space="preserve"> that unwanted frequencies (&lt;0.5 Hz, 50 Hz, and &gt;100 Hz) are strongly reduced in the filtered signals</w:t>
+      </w:r>
+      <w:r>
+        <w:rPr>
+          <w:rFonts w:asciiTheme="majorBidi" w:hAnsiTheme="majorBidi" w:cstheme="majorBidi"/>
+          <w:sz w:val="28"/>
+          <w:szCs w:val="28"/>
+        </w:rPr>
+        <w:t>.</w:t>
+      </w:r>
+    </w:p>
+    <w:p>
+      <w:pPr>
+        <w:jc w:val="both"/>
+        <w:rPr>
+          <w:rFonts w:asciiTheme="majorBidi" w:hAnsiTheme="majorBidi" w:cstheme="majorBidi"/>
+          <w:sz w:val="28"/>
+          <w:szCs w:val="28"/>
+        </w:rPr>
+      </w:pPr>
+      <w:r>
+        <w:rPr>
+          <w:rFonts w:asciiTheme="majorBidi" w:hAnsiTheme="majorBidi" w:cstheme="majorBidi"/>
+          <w:sz w:val="28"/>
+          <w:szCs w:val="28"/>
+        </w:rPr>
+        <w:t>The SNR improvement calculation goes a step further to prove that the quality of the output signal has improved compared to the raw one, without sacrificing QRS complex integrity.</w:t>
+      </w:r>
+    </w:p>
+    <w:p>
+      <w:pPr>
+        <w:jc w:val="both"/>
+        <w:rPr>
+          <w:rFonts w:asciiTheme="majorBidi" w:hAnsiTheme="majorBidi" w:cstheme="majorBidi"/>
+          <w:sz w:val="28"/>
+          <w:szCs w:val="28"/>
+        </w:rPr>
+      </w:pPr>
+    </w:p>
+    <w:p>
+      <w:pPr>
+        <w:jc w:val="both"/>
+        <w:rPr>
+          <w:rFonts w:asciiTheme="majorBidi" w:hAnsiTheme="majorBidi" w:cstheme="majorBidi"/>
+          <w:sz w:val="28"/>
+          <w:szCs w:val="28"/>
+        </w:rPr>
+      </w:pPr>
+      <w:r>
+        <w:rPr>
+          <w:rFonts w:asciiTheme="majorBidi" w:hAnsiTheme="majorBidi" w:cstheme="majorBidi"/>
+          <w:b/>
+          <w:bCs/>
+          <w:sz w:val="28"/>
+          <w:szCs w:val="28"/>
+        </w:rPr>
+        <w:t>Distortions and Possible Limitations</w:t>
+      </w:r>
+    </w:p>
+    <w:p>
+      <w:pPr>
+        <w:pStyle w:val="ListParagraph"/>
+        <w:numPr>
+          <w:ilvl w:val="0"/>
+          <w:numId w:val="8"/>
+        </w:numPr>
+        <w:jc w:val="both"/>
+        <w:rPr>
+          <w:rFonts w:asciiTheme="majorBidi" w:hAnsiTheme="majorBidi" w:cstheme="majorBidi"/>
+          <w:sz w:val="28"/>
+          <w:szCs w:val="28"/>
+        </w:rPr>
+      </w:pPr>
+      <w:r>
+        <w:rPr>
+          <w:rFonts w:asciiTheme="majorBidi" w:hAnsiTheme="majorBidi" w:cstheme="majorBidi"/>
+          <w:sz w:val="28"/>
+          <w:szCs w:val="28"/>
+        </w:rPr>
+        <w:t>FIR low‑pass filter: Works well to remove muscle noise, but needs many coefficients (higher order), which makes it slower and heavier for real‑time systems.</w:t>
+      </w:r>
+    </w:p>
+    <w:p>
+      <w:pPr>
+        <w:pStyle w:val="ListParagraph"/>
+        <w:numPr>
+          <w:ilvl w:val="0"/>
+          <w:numId w:val="8"/>
+        </w:numPr>
+        <w:jc w:val="both"/>
+        <w:rPr>
+          <w:rFonts w:asciiTheme="majorBidi" w:hAnsiTheme="majorBidi" w:cstheme="majorBidi"/>
+          <w:sz w:val="28"/>
+          <w:szCs w:val="28"/>
+        </w:rPr>
+      </w:pPr>
+      <w:r>
+        <w:rPr>
+          <w:rFonts w:asciiTheme="majorBidi" w:hAnsiTheme="majorBidi" w:cstheme="majorBidi"/>
+          <w:sz w:val="28"/>
+          <w:szCs w:val="28"/>
+        </w:rPr>
+        <w:t>IIR filters: More efficient (lower order</w:t>
+      </w:r>
+      <w:proofErr w:type="gramStart"/>
+      <w:r>
+        <w:rPr>
+          <w:rFonts w:asciiTheme="majorBidi" w:hAnsiTheme="majorBidi" w:cstheme="majorBidi"/>
+          <w:sz w:val="28"/>
+          <w:szCs w:val="28"/>
+        </w:rPr>
+        <w:t>), but</w:t>
+      </w:r>
+      <w:proofErr w:type="gramEnd"/>
+      <w:r>
+        <w:rPr>
+          <w:rFonts w:asciiTheme="majorBidi" w:hAnsiTheme="majorBidi" w:cstheme="majorBidi"/>
+          <w:sz w:val="28"/>
+          <w:szCs w:val="28"/>
+        </w:rPr>
+        <w:t xml:space="preserve"> can cause phase distortion if not handled carefully.</w:t>
+      </w:r>
+    </w:p>
+    <w:p>
+      <w:pPr>
+        <w:pStyle w:val="ListParagraph"/>
+        <w:numPr>
+          <w:ilvl w:val="0"/>
+          <w:numId w:val="8"/>
+        </w:numPr>
+        <w:jc w:val="both"/>
+        <w:rPr>
+          <w:rFonts w:asciiTheme="majorBidi" w:hAnsiTheme="majorBidi" w:cstheme="majorBidi"/>
+          <w:sz w:val="28"/>
+          <w:szCs w:val="28"/>
+        </w:rPr>
+      </w:pPr>
+      <w:r>
+        <w:rPr>
+          <w:rFonts w:asciiTheme="majorBidi" w:hAnsiTheme="majorBidi" w:cstheme="majorBidi"/>
+          <w:sz w:val="28"/>
+          <w:szCs w:val="28"/>
+        </w:rPr>
+        <w:t>Residual noise: Some muscle noise overlaps with useful ECG frequencies, so removing it completely could also weaken real signal details.</w:t>
+      </w:r>
+    </w:p>
+    <w:p>
+      <w:pPr>
         <w:spacing w:line="278" w:lineRule="auto"/>
         <w:rPr>
           <w:rFonts w:ascii="Century Schoolbook" w:hAnsi="Century Schoolbook"/>
           <w:sz w:val="16"/>
           <w:szCs w:val="16"/>
-        </w:rPr>
-      </w:pPr>
-      <w:r>
-        <w:rPr>
-          <w:rFonts w:ascii="Century Schoolbook" w:hAnsi="Century Schoolbook"/>
-          <w:sz w:val="16"/>
-          <w:szCs w:val="16"/>
-        </w:rPr>
-        <w:br w:type="page"/>
-      </w:r>
-    </w:p>
-    <w:p>
-      <w:pPr>
-        <w:rPr>
-          <w:rFonts w:asciiTheme="majorBidi" w:hAnsiTheme="majorBidi" w:cstheme="majorBidi"/>
-          <w:sz w:val="28"/>
-          <w:szCs w:val="28"/>
         </w:rPr>
       </w:pPr>
     </w:p>
@@ -7202,6 +7533,92 @@
     </w:lvl>
   </w:abstractNum>
   <w:abstractNum w:abstractNumId="5" w15:restartNumberingAfterBreak="0">
+    <w:nsid w:val="33AF75F6"/>
+    <w:multiLevelType w:val="hybridMultilevel"/>
+    <w:tmpl w:val="75F6BB08"/>
+    <w:lvl w:ilvl="0" w:tplc="0409000F">
+      <w:start w:val="1"/>
+      <w:numFmt w:val="decimal"/>
+      <w:lvlText w:val="%1."/>
+      <w:lvlJc w:val="left"/>
+      <w:pPr>
+        <w:ind w:left="720" w:hanging="360"/>
+      </w:pPr>
+    </w:lvl>
+    <w:lvl w:ilvl="1" w:tplc="04090019" w:tentative="1">
+      <w:start w:val="1"/>
+      <w:numFmt w:val="lowerLetter"/>
+      <w:lvlText w:val="%2."/>
+      <w:lvlJc w:val="left"/>
+      <w:pPr>
+        <w:ind w:left="1440" w:hanging="360"/>
+      </w:pPr>
+    </w:lvl>
+    <w:lvl w:ilvl="2" w:tplc="0409001B" w:tentative="1">
+      <w:start w:val="1"/>
+      <w:numFmt w:val="lowerRoman"/>
+      <w:lvlText w:val="%3."/>
+      <w:lvlJc w:val="right"/>
+      <w:pPr>
+        <w:ind w:left="2160" w:hanging="180"/>
+      </w:pPr>
+    </w:lvl>
+    <w:lvl w:ilvl="3" w:tplc="0409000F" w:tentative="1">
+      <w:start w:val="1"/>
+      <w:numFmt w:val="decimal"/>
+      <w:lvlText w:val="%4."/>
+      <w:lvlJc w:val="left"/>
+      <w:pPr>
+        <w:ind w:left="2880" w:hanging="360"/>
+      </w:pPr>
+    </w:lvl>
+    <w:lvl w:ilvl="4" w:tplc="04090019" w:tentative="1">
+      <w:start w:val="1"/>
+      <w:numFmt w:val="lowerLetter"/>
+      <w:lvlText w:val="%5."/>
+      <w:lvlJc w:val="left"/>
+      <w:pPr>
+        <w:ind w:left="3600" w:hanging="360"/>
+      </w:pPr>
+    </w:lvl>
+    <w:lvl w:ilvl="5" w:tplc="0409001B" w:tentative="1">
+      <w:start w:val="1"/>
+      <w:numFmt w:val="lowerRoman"/>
+      <w:lvlText w:val="%6."/>
+      <w:lvlJc w:val="right"/>
+      <w:pPr>
+        <w:ind w:left="4320" w:hanging="180"/>
+      </w:pPr>
+    </w:lvl>
+    <w:lvl w:ilvl="6" w:tplc="0409000F" w:tentative="1">
+      <w:start w:val="1"/>
+      <w:numFmt w:val="decimal"/>
+      <w:lvlText w:val="%7."/>
+      <w:lvlJc w:val="left"/>
+      <w:pPr>
+        <w:ind w:left="5040" w:hanging="360"/>
+      </w:pPr>
+    </w:lvl>
+    <w:lvl w:ilvl="7" w:tplc="04090019" w:tentative="1">
+      <w:start w:val="1"/>
+      <w:numFmt w:val="lowerLetter"/>
+      <w:lvlText w:val="%8."/>
+      <w:lvlJc w:val="left"/>
+      <w:pPr>
+        <w:ind w:left="5760" w:hanging="360"/>
+      </w:pPr>
+    </w:lvl>
+    <w:lvl w:ilvl="8" w:tplc="0409001B" w:tentative="1">
+      <w:start w:val="1"/>
+      <w:numFmt w:val="lowerRoman"/>
+      <w:lvlText w:val="%9."/>
+      <w:lvlJc w:val="right"/>
+      <w:pPr>
+        <w:ind w:left="6480" w:hanging="180"/>
+      </w:pPr>
+    </w:lvl>
+  </w:abstractNum>
+  <w:abstractNum w:abstractNumId="6" w15:restartNumberingAfterBreak="0">
     <w:nsid w:val="4F007F52"/>
     <w:multiLevelType w:val="hybridMultilevel"/>
     <w:tmpl w:val="D93698E4"/>
@@ -7313,7 +7730,7 @@
       </w:rPr>
     </w:lvl>
   </w:abstractNum>
-  <w:abstractNum w:abstractNumId="6" w15:restartNumberingAfterBreak="0">
+  <w:abstractNum w:abstractNumId="7" w15:restartNumberingAfterBreak="0">
     <w:nsid w:val="513828B0"/>
     <w:multiLevelType w:val="hybridMultilevel"/>
     <w:tmpl w:val="3848914A"/>
@@ -7436,7 +7853,7 @@
     <w:abstractNumId w:val="1"/>
   </w:num>
   <w:num w:numId="4" w16cid:durableId="1319916811">
-    <w:abstractNumId w:val="6"/>
+    <w:abstractNumId w:val="7"/>
   </w:num>
   <w:num w:numId="5" w16cid:durableId="404114550">
     <w:abstractNumId w:val="0"/>
@@ -7445,6 +7862,9 @@
     <w:abstractNumId w:val="4"/>
   </w:num>
   <w:num w:numId="7" w16cid:durableId="1861092048">
+    <w:abstractNumId w:val="6"/>
+  </w:num>
+  <w:num w:numId="8" w16cid:durableId="1206484524">
     <w:abstractNumId w:val="5"/>
   </w:num>
 </w:numbering>
@@ -8061,7 +8481,6 @@
   <w:style w:type="character" w:default="1" w:styleId="DefaultParagraphFont">
     <w:name w:val="Default Paragraph Font"/>
     <w:uiPriority w:val="1"/>
-    <w:semiHidden/>
     <w:unhideWhenUsed/>
   </w:style>
   <w:style w:type="table" w:default="1" w:styleId="TableNormal">

</xml_diff>